<commit_message>
Vertrag: 5 Calls, feste Preise, Zahlungsweise und Launchrabatt zum Ankreuzen
- 5 persönliche 1:1 Calls (Start, drei im Verlauf, Abschluss)
- Beträge fest: 11.980 € netto / 14.256,20 € brutto, 4 Raten à 3.564,05 €
- Launchrabatt (48h) mit Ja/Nein-Ankreuzfeld: 1 Monat geschenkt,
  3 % Skonto bei Einmalzahlung (Zahlbetrag 13.828,51 €)
- Mini-Produkte-Satz in Vertragssprache, Zwischenüberschriften im Markenstil

Co-Authored-By: Claude Fable 5 <noreply@anthropic.com>
Claude-Session: https://claude.ai/code/session_01DJZgzLyKPM9Jp9y2dQbeG3
</commit_message>
<xml_diff>
--- a/vertraege/6-Monats-Begleitung_Vertrag_und_Rechnung.docx
+++ b/vertraege/6-Monats-Begleitung_Vertrag_und_Rechnung.docx
@@ -554,7 +554,7 @@
           <w:rFonts w:ascii="Georgia" w:hAnsi="Georgia"/>
           <w:sz w:val="18"/>
         </w:rPr>
-        <w:t>3 persönliche 1:1 Calls mit Svenja: einer zum Start, einer pro Quartal</w:t>
+        <w:t>5 persönliche 1:1 Calls mit Svenja: einer zum Start, drei im Verlauf der Begleitung, einer zum Abschluss</w:t>
       </w:r>
     </w:p>
     <w:p>
@@ -621,7 +621,7 @@
           <w:color w:val="6B6469"/>
           <w:sz w:val="17"/>
         </w:rPr>
-        <w:t>Deine Mini-Produkte erstellst du selbst. Wir zeigen dir Schritt für Schritt, wie das geht.</w:t>
+        <w:t>Die inhaltliche Erstellung der Mini-Produkte liegt bei der Auftraggeberin; sie wird dabei durch Schritt-für-Schritt-Anleitungen, Vorlagen und die laufende Begleitung vollumfänglich unterstützt.</w:t>
       </w:r>
     </w:p>
     <w:p>
@@ -925,7 +925,7 @@
                 <w:color w:val="282427"/>
                 <w:sz w:val="19"/>
               </w:rPr>
-              <w:t>______________ €</w:t>
+              <w:t>11.980,00 €</w:t>
             </w:r>
           </w:p>
         </w:tc>
@@ -986,7 +986,7 @@
                 <w:color w:val="282427"/>
                 <w:sz w:val="19"/>
               </w:rPr>
-              <w:t>______________ €</w:t>
+              <w:t>11.980,00 €</w:t>
             </w:r>
           </w:p>
         </w:tc>
@@ -1030,7 +1030,7 @@
                 <w:color w:val="282427"/>
                 <w:sz w:val="19"/>
               </w:rPr>
-              <w:t>______________ €</w:t>
+              <w:t>2.276,20 €</w:t>
             </w:r>
           </w:p>
         </w:tc>
@@ -1076,7 +1076,7 @@
                 <w:color w:val="7A1F1F"/>
                 <w:sz w:val="21"/>
               </w:rPr>
-              <w:t>______________ €</w:t>
+              <w:t>14.256,20 €</w:t>
             </w:r>
           </w:p>
         </w:tc>
@@ -1094,7 +1094,7 @@
           <w:color w:val="6B6469"/>
           <w:sz w:val="17"/>
         </w:rPr>
-        <w:t>Zahlbar nach Erhalt der Rechnung auf das unten angegebene Konto unter Angabe der Rechnungsnummer. Die Leistungserbringung erfolgt nach Zahlungseingang. Die Zahlung ist wahlweise als Einmalzahlung oder in Raten möglich.</w:t>
+        <w:t>Zahlbar auf das unten angegebene Konto unter Angabe der Rechnungsnummer. Die Leistungserbringung erfolgt nach Zahlungseingang der ersten Zahlung.</w:t>
       </w:r>
     </w:p>
     <w:p>
@@ -1104,10 +1104,10 @@
       <w:r>
         <w:rPr>
           <w:rFonts w:ascii="Georgia" w:hAnsi="Georgia" w:eastAsia="Georgia"/>
-          <w:b w:val="0"/>
+          <w:b/>
           <w:i w:val="0"/>
-          <w:color w:val="6B6469"/>
-          <w:sz w:val="17"/>
+          <w:color w:val="7A1F1F"/>
+          <w:sz w:val="14"/>
         </w:rPr>
         <w:t>ZAHLUNGSWEISE (bitte ankreuzen)</w:t>
       </w:r>
@@ -1124,7 +1124,7 @@
           <w:color w:val="6B6469"/>
           <w:sz w:val="17"/>
         </w:rPr>
-        <w:t>☐   Einmalzahlung: ______________ €</w:t>
+        <w:t>☐   Einmalzahlung: 14.256,20 € inkl. 19 % USt, zahlbar nach Erhalt der Rechnung</w:t>
       </w:r>
     </w:p>
     <w:p>
@@ -1139,7 +1139,22 @@
           <w:color w:val="6B6469"/>
           <w:sz w:val="17"/>
         </w:rPr>
-        <w:t>☐   Ratenzahlung: ______ monatliche Raten à ______________ € (Gesamtbetrag: ______________ €)</w:t>
+        <w:t>☐   Ratenzahlung: 4 monatliche Raten à 3.564,05 € inkl. 19 % USt (Gesamtbetrag 14.256,20 €), die erste Rate zahlbar nach Erhalt der Rechnung, die weiteren jeweils im Abstand eines Monats</w:t>
+      </w:r>
+    </w:p>
+    <w:p>
+      <w:pPr>
+        <w:spacing w:before="120" w:after="140"/>
+      </w:pPr>
+      <w:r>
+        <w:rPr>
+          <w:rFonts w:ascii="Georgia" w:hAnsi="Georgia" w:eastAsia="Georgia"/>
+          <w:b/>
+          <w:i w:val="0"/>
+          <w:color w:val="7A1F1F"/>
+          <w:sz w:val="14"/>
+        </w:rPr>
+        <w:t>LAUNCHRABATT · BUCHUNG INNERHALB VON 48 STUNDEN (bitte ankreuzen)</w:t>
       </w:r>
     </w:p>
     <w:p>
@@ -1154,7 +1169,7 @@
           <w:color w:val="6B6469"/>
           <w:sz w:val="17"/>
         </w:rPr>
-        <w:t>BUCHUNGS-BONUS · 48 STUNDEN</w:t>
+        <w:t>☐   Ja, ich nehme den Launchrabatt in Anspruch.          ☐   Nein</w:t>
       </w:r>
     </w:p>
     <w:p>
@@ -1169,22 +1184,7 @@
           <w:color w:val="6B6469"/>
           <w:sz w:val="17"/>
         </w:rPr>
-        <w:t>Bei verbindlicher Buchung innerhalb von 48 Stunden nach dem Beratungsgespräch erhältst du 1 Monat Begleitung zusätzlich geschenkt (7 statt 6 Monate).</w:t>
-      </w:r>
-    </w:p>
-    <w:p>
-      <w:pPr>
-        <w:spacing w:before="120" w:after="140"/>
-      </w:pPr>
-      <w:r>
-        <w:rPr>
-          <w:rFonts w:ascii="Georgia" w:hAnsi="Georgia" w:eastAsia="Georgia"/>
-          <w:b w:val="0"/>
-          <w:i w:val="0"/>
-          <w:color w:val="6B6469"/>
-          <w:sz w:val="17"/>
-        </w:rPr>
-        <w:t>Zusätzlich erhältst du 3 % Rabatt auf den Gesamtpreis, wenn die Zahlung als Einmalzahlung innerhalb von 48 Stunden auf das unten angegebene Konto erfolgt.</w:t>
+        <w:t>Der Launchrabatt gilt bei verbindlicher Buchung innerhalb von 48 Stunden nach dem Beratungsgespräch. Bei Inanspruchnahme verlängert sich die Begleitung ohne Mehrkosten um einen zusätzlichen Monat (7 statt 6 Monate). Erfolgt die Zahlung zudem als Einmalzahlung innerhalb von 48 Stunden auf das unten angegebene Konto, werden 3 % Skonto auf den Rechnungsbetrag gewährt; der Zahlbetrag reduziert sich in diesem Fall auf 13.828,51 €.</w:t>
       </w:r>
     </w:p>
     <w:tbl>

</xml_diff>